<commit_message>
fix: update CV to latest version, fix CGPA to 6.11
</commit_message>
<xml_diff>
--- a/public/Rahul_Kumawat_CV.docx
+++ b/public/Rahul_Kumawat_CV.docx
@@ -698,48 +698,49 @@
         </w:rPr>
         <w:t xml:space="preserve"> </w:t>
       </w:r>
-      <w:r>
-        <w:rPr>
-          <w:rStyle w:val="Heading5Char"/>
+      <w:hyperlink r:id="rId11" w:history="1">
+        <w:r>
+          <w:rPr>
+            <w:rStyle w:val="IntenseEmphasis"/>
+            <w:rFonts w:ascii="Arial" w:hAnsi="Arial" w:cs="Arial"/>
+            <w:b/>
+            <w:bCs/>
+            <w:i w:val="0"/>
+            <w:iCs w:val="0"/>
+          </w:rPr>
+          <w:t>GitHub</w:t>
+        </w:r>
+        <w:r>
+          <w:rPr>
+            <w:rStyle w:val="IntenseEmphasis"/>
+            <w:rFonts w:ascii="Arial" w:hAnsi="Arial" w:cs="Arial"/>
+            <w:b/>
+            <w:bCs/>
+            <w:i w:val="0"/>
+            <w:iCs w:val="0"/>
+          </w:rPr>
+          <w:t xml:space="preserve">                                                                                             </w:t>
+        </w:r>
+        <w:r>
+          <w:rPr>
+            <w:rStyle w:val="IntenseEmphasis"/>
+            <w:rFonts w:ascii="Arial" w:hAnsi="Arial" w:cs="Arial"/>
+            <w:b/>
+            <w:bCs/>
+            <w:i w:val="0"/>
+            <w:iCs w:val="0"/>
+          </w:rPr>
+          <w:t xml:space="preserve">        </w:t>
+        </w:r>
+      </w:hyperlink>
+      <w:r>
+        <w:rPr>
+          <w:rStyle w:val="IntenseEmphasis"/>
           <w:rFonts w:ascii="Arial" w:hAnsi="Arial" w:cs="Arial"/>
           <w:b/>
           <w:bCs/>
-        </w:rPr>
-        <w:t>Git</w:t>
-      </w:r>
-      <w:r>
-        <w:rPr>
-          <w:rStyle w:val="Heading5Char"/>
-          <w:rFonts w:ascii="Arial" w:hAnsi="Arial" w:cs="Arial"/>
-          <w:b/>
-          <w:bCs/>
-        </w:rPr>
-        <w:t>H</w:t>
-      </w:r>
-      <w:r>
-        <w:rPr>
-          <w:rStyle w:val="Heading5Char"/>
-          <w:rFonts w:ascii="Arial" w:hAnsi="Arial" w:cs="Arial"/>
-          <w:b/>
-          <w:bCs/>
-        </w:rPr>
-        <w:t>ub</w:t>
-      </w:r>
-      <w:r>
-        <w:rPr>
-          <w:rStyle w:val="Heading5Char"/>
-          <w:rFonts w:ascii="Arial" w:hAnsi="Arial" w:cs="Arial"/>
-          <w:b/>
-          <w:bCs/>
-        </w:rPr>
-        <w:t xml:space="preserve">                                                                                             </w:t>
-      </w:r>
-      <w:r>
-        <w:rPr>
-          <w:rStyle w:val="Heading5Char"/>
-          <w:rFonts w:ascii="Arial" w:hAnsi="Arial" w:cs="Arial"/>
-          <w:b/>
-          <w:bCs/>
+          <w:i w:val="0"/>
+          <w:iCs w:val="0"/>
         </w:rPr>
         <w:t xml:space="preserve"> </w:t>
       </w:r>
@@ -751,7 +752,27 @@
           <w:iCs w:val="0"/>
           <w:color w:val="4F81BD" w:themeColor="accent1"/>
         </w:rPr>
-        <w:t>Nov 202</w:t>
+        <w:t>Nov</w:t>
+      </w:r>
+      <w:r>
+        <w:rPr>
+          <w:rStyle w:val="Heading4Char"/>
+          <w:rFonts w:ascii="Arial" w:hAnsi="Arial" w:cs="Arial"/>
+          <w:i w:val="0"/>
+          <w:iCs w:val="0"/>
+          <w:color w:val="4F81BD" w:themeColor="accent1"/>
+        </w:rPr>
+        <w:t>’</w:t>
+      </w:r>
+      <w:r>
+        <w:rPr>
+          <w:rStyle w:val="Heading4Char"/>
+          <w:rFonts w:ascii="Arial" w:hAnsi="Arial" w:cs="Arial"/>
+          <w:i w:val="0"/>
+          <w:iCs w:val="0"/>
+          <w:color w:val="4F81BD" w:themeColor="accent1"/>
+        </w:rPr>
+        <w:t xml:space="preserve"> 202</w:t>
       </w:r>
       <w:r>
         <w:rPr>
@@ -902,7 +923,7 @@
         </w:rPr>
         <w:t xml:space="preserve">AI Weather Forecast Website | </w:t>
       </w:r>
-      <w:hyperlink r:id="rId11" w:history="1">
+      <w:hyperlink r:id="rId12" w:history="1">
         <w:r>
           <w:rPr>
             <w:rStyle w:val="Hyperlink"/>
@@ -931,7 +952,23 @@
             <w:sz w:val="22"/>
             <w:szCs w:val="22"/>
           </w:rPr>
-          <w:t xml:space="preserve">                                                                               </w:t>
+          <w:t xml:space="preserve">                                                                              </w:t>
+        </w:r>
+        <w:r>
+          <w:rPr>
+            <w:rFonts w:ascii="Arial" w:hAnsi="Arial" w:cs="Arial"/>
+            <w:sz w:val="22"/>
+            <w:szCs w:val="22"/>
+          </w:rPr>
+          <w:t xml:space="preserve">        </w:t>
+        </w:r>
+        <w:r>
+          <w:rPr>
+            <w:rFonts w:ascii="Arial" w:hAnsi="Arial" w:cs="Arial"/>
+            <w:sz w:val="22"/>
+            <w:szCs w:val="22"/>
+          </w:rPr>
+          <w:t xml:space="preserve"> </w:t>
         </w:r>
         <w:r>
           <w:rPr>
@@ -950,7 +987,29 @@
             <w:sz w:val="22"/>
             <w:szCs w:val="22"/>
           </w:rPr>
-          <w:t>Mar 2025</w:t>
+          <w:t>Mar</w:t>
+        </w:r>
+        <w:r>
+          <w:rPr>
+            <w:rFonts w:ascii="Arial" w:hAnsi="Arial" w:cs="Arial"/>
+            <w:b w:val="0"/>
+            <w:bCs w:val="0"/>
+            <w:color w:val="4F81BD" w:themeColor="accent1"/>
+            <w:sz w:val="22"/>
+            <w:szCs w:val="22"/>
+          </w:rPr>
+          <w:t>’</w:t>
+        </w:r>
+        <w:r>
+          <w:rPr>
+            <w:rFonts w:ascii="Arial" w:hAnsi="Arial" w:cs="Arial"/>
+            <w:b w:val="0"/>
+            <w:bCs w:val="0"/>
+            <w:color w:val="4F81BD" w:themeColor="accent1"/>
+            <w:sz w:val="22"/>
+            <w:szCs w:val="22"/>
+          </w:rPr>
+          <w:t xml:space="preserve"> 2025</w:t>
         </w:r>
         <w:r>
           <w:rPr>
@@ -1129,24 +1188,26 @@
         </w:rPr>
         <w:t xml:space="preserve">| </w:t>
       </w:r>
-      <w:hyperlink r:id="rId12" w:history="1">
+      <w:hyperlink r:id="rId13" w:history="1">
         <w:r>
           <w:rPr>
-            <w:rStyle w:val="Hyperlink"/>
-            <w:rFonts w:ascii="Arial" w:eastAsiaTheme="majorEastAsia" w:hAnsi="Arial" w:cs="Arial"/>
+            <w:rStyle w:val="IntenseEmphasis"/>
+            <w:rFonts w:ascii="Arial" w:hAnsi="Arial" w:cs="Arial"/>
+            <w:i w:val="0"/>
+            <w:iCs w:val="0"/>
             <w:sz w:val="22"/>
             <w:szCs w:val="22"/>
-            <w:u w:val="none"/>
           </w:rPr>
           <w:t>G</w:t>
         </w:r>
         <w:r>
           <w:rPr>
-            <w:rStyle w:val="Hyperlink"/>
-            <w:rFonts w:ascii="Arial" w:eastAsiaTheme="majorEastAsia" w:hAnsi="Arial" w:cs="Arial"/>
+            <w:rStyle w:val="IntenseEmphasis"/>
+            <w:rFonts w:ascii="Arial" w:hAnsi="Arial" w:cs="Arial"/>
+            <w:i w:val="0"/>
+            <w:iCs w:val="0"/>
             <w:sz w:val="22"/>
             <w:szCs w:val="22"/>
-            <w:u w:val="none"/>
           </w:rPr>
           <w:t>itHub</w:t>
         </w:r>
@@ -1158,7 +1219,7 @@
           <w:sz w:val="22"/>
           <w:szCs w:val="22"/>
         </w:rPr>
-        <w:t xml:space="preserve"> </w:t>
+        <w:t xml:space="preserve">                                                                              </w:t>
       </w:r>
       <w:r>
         <w:rPr>
@@ -1167,7 +1228,7 @@
           <w:sz w:val="22"/>
           <w:szCs w:val="22"/>
         </w:rPr>
-        <w:t xml:space="preserve">                                                                             </w:t>
+        <w:t xml:space="preserve">        </w:t>
       </w:r>
       <w:r>
         <w:rPr>
@@ -1176,7 +1237,7 @@
           <w:sz w:val="22"/>
           <w:szCs w:val="22"/>
         </w:rPr>
-        <w:t xml:space="preserve">        </w:t>
+        <w:t xml:space="preserve"> </w:t>
       </w:r>
       <w:r>
         <w:rPr>
@@ -1185,7 +1246,7 @@
           <w:sz w:val="22"/>
           <w:szCs w:val="22"/>
         </w:rPr>
-        <w:t xml:space="preserve"> </w:t>
+        <w:t xml:space="preserve">       </w:t>
       </w:r>
       <w:r>
         <w:rPr>
@@ -1349,8 +1410,8 @@
         <w:rPr>
           <w:rFonts w:ascii="Arial" w:hAnsi="Arial" w:cs="Arial"/>
           <w:noProof/>
-          <w:sz w:val="22"/>
-          <w:szCs w:val="22"/>
+          <w:sz w:val="24"/>
+          <w:szCs w:val="24"/>
         </w:rPr>
         <mc:AlternateContent>
           <mc:Choice Requires="wps">
@@ -1439,35 +1500,41 @@
           <w:smallCaps/>
           <w:color w:val="002060"/>
           <w:spacing w:val="-2"/>
+          <w:sz w:val="24"/>
+          <w:szCs w:val="24"/>
+        </w:rPr>
+        <w:t>Training</w:t>
+      </w:r>
+    </w:p>
+    <w:p>
+      <w:pPr>
+        <w:pStyle w:val="Heading1"/>
+        <w:spacing w:before="136"/>
+        <w:rPr>
+          <w:rFonts w:ascii="Arial" w:hAnsi="Arial" w:cs="Arial"/>
+          <w:b/>
+          <w:bCs/>
           <w:sz w:val="22"/>
           <w:szCs w:val="22"/>
         </w:rPr>
-        <w:t>Training</w:t>
-      </w:r>
-    </w:p>
-    <w:p>
-      <w:pPr>
-        <w:pStyle w:val="Heading1"/>
-        <w:spacing w:before="136"/>
-        <w:rPr>
-          <w:rFonts w:ascii="Arial" w:hAnsi="Arial" w:cs="Arial"/>
-          <w:sz w:val="22"/>
-          <w:szCs w:val="22"/>
-        </w:rPr>
-      </w:pPr>
-      <w:r>
-        <w:rPr>
-          <w:rFonts w:ascii="Arial" w:hAnsi="Arial" w:cs="Arial"/>
+      </w:pPr>
+      <w:r>
+        <w:rPr>
+          <w:rFonts w:ascii="Arial" w:hAnsi="Arial" w:cs="Arial"/>
+          <w:b/>
+          <w:bCs/>
           <w:color w:val="4F81BD" w:themeColor="accent1"/>
           <w:spacing w:val="-6"/>
           <w:sz w:val="22"/>
           <w:szCs w:val="22"/>
         </w:rPr>
-        <w:t>Cyber Security &amp; Ethical Hacking</w:t>
-      </w:r>
-      <w:r>
-        <w:rPr>
-          <w:rFonts w:ascii="Arial" w:hAnsi="Arial" w:cs="Arial"/>
+        <w:t>Cyber Security &amp; Ethical Hacking Training Program | The</w:t>
+      </w:r>
+      <w:r>
+        <w:rPr>
+          <w:rFonts w:ascii="Arial" w:hAnsi="Arial" w:cs="Arial"/>
+          <w:b/>
+          <w:bCs/>
           <w:color w:val="4F81BD" w:themeColor="accent1"/>
           <w:spacing w:val="-6"/>
           <w:sz w:val="22"/>
@@ -1475,31 +1542,13 @@
         </w:rPr>
         <w:t xml:space="preserve"> </w:t>
       </w:r>
-      <w:r>
-        <w:rPr>
-          <w:rFonts w:ascii="Arial" w:hAnsi="Arial" w:cs="Arial"/>
-          <w:color w:val="4F81BD" w:themeColor="accent1"/>
-          <w:spacing w:val="-6"/>
-          <w:sz w:val="22"/>
-          <w:szCs w:val="22"/>
-        </w:rPr>
-        <w:t>Training Program | The</w:t>
-      </w:r>
-      <w:r>
-        <w:rPr>
-          <w:rFonts w:ascii="Arial" w:hAnsi="Arial" w:cs="Arial"/>
-          <w:color w:val="4F81BD" w:themeColor="accent1"/>
-          <w:spacing w:val="-6"/>
-          <w:sz w:val="22"/>
-          <w:szCs w:val="22"/>
-        </w:rPr>
-        <w:t xml:space="preserve"> </w:t>
-      </w:r>
-      <w:hyperlink r:id="rId13" w:history="1">
+      <w:hyperlink r:id="rId14" w:history="1">
         <w:r>
           <w:rPr>
             <w:rStyle w:val="Hyperlink"/>
             <w:rFonts w:ascii="Arial" w:hAnsi="Arial" w:cs="Arial"/>
+            <w:b/>
+            <w:bCs/>
             <w:color w:val="4F81BD" w:themeColor="accent1"/>
             <w:spacing w:val="-6"/>
             <w:sz w:val="22"/>
@@ -1512,6 +1561,8 @@
           <w:rPr>
             <w:rStyle w:val="Hyperlink"/>
             <w:rFonts w:ascii="Arial" w:hAnsi="Arial" w:cs="Arial"/>
+            <w:b/>
+            <w:bCs/>
             <w:color w:val="4F81BD" w:themeColor="accent1"/>
             <w:spacing w:val="-6"/>
             <w:sz w:val="22"/>
@@ -1524,13 +1575,15 @@
           <w:rPr>
             <w:rStyle w:val="Hyperlink"/>
             <w:rFonts w:ascii="Arial" w:hAnsi="Arial" w:cs="Arial"/>
+            <w:b/>
+            <w:bCs/>
             <w:color w:val="4F81BD" w:themeColor="accent1"/>
             <w:spacing w:val="-6"/>
             <w:sz w:val="22"/>
             <w:szCs w:val="22"/>
             <w:u w:val="none"/>
           </w:rPr>
-          <w:t xml:space="preserve">               </w:t>
+          <w:t xml:space="preserve">        </w:t>
         </w:r>
         <w:r>
           <w:rPr>
@@ -1542,31 +1595,7 @@
             <w:szCs w:val="22"/>
             <w:u w:val="none"/>
           </w:rPr>
-          <w:t xml:space="preserve">      </w:t>
-        </w:r>
-        <w:r>
-          <w:rPr>
-            <w:rStyle w:val="Hyperlink"/>
-            <w:rFonts w:ascii="Arial" w:hAnsi="Arial" w:cs="Arial"/>
-            <w:color w:val="4F81BD" w:themeColor="accent1"/>
-            <w:spacing w:val="-6"/>
-            <w:sz w:val="22"/>
-            <w:szCs w:val="22"/>
-            <w:u w:val="none"/>
-          </w:rPr>
-          <w:t>Nov 2025</w:t>
-        </w:r>
-        <w:r>
-          <w:rPr>
-            <w:rStyle w:val="Hyperlink"/>
-            <w:rFonts w:ascii="Arial" w:hAnsi="Arial" w:cs="Arial"/>
-            <w:color w:val="4F81BD" w:themeColor="accent1"/>
-            <w:spacing w:val="-6"/>
-            <w:sz w:val="22"/>
-            <w:szCs w:val="22"/>
-            <w:u w:val="none"/>
-          </w:rPr>
-          <w:t xml:space="preserve">                                                                                                </w:t>
+          <w:t xml:space="preserve">     </w:t>
         </w:r>
         <w:r>
           <w:rPr>
@@ -1602,12 +1631,106 @@
             <w:szCs w:val="22"/>
             <w:u w:val="none"/>
           </w:rPr>
+          <w:t>Nov</w:t>
+        </w:r>
+        <w:r>
+          <w:rPr>
+            <w:rStyle w:val="Hyperlink"/>
+            <w:rFonts w:ascii="Arial" w:hAnsi="Arial" w:cs="Arial"/>
+            <w:color w:val="4F81BD" w:themeColor="accent1"/>
+            <w:spacing w:val="-6"/>
+            <w:sz w:val="22"/>
+            <w:szCs w:val="22"/>
+            <w:u w:val="none"/>
+          </w:rPr>
+          <w:t>’</w:t>
+        </w:r>
+        <w:r>
+          <w:rPr>
+            <w:rStyle w:val="Hyperlink"/>
+            <w:rFonts w:ascii="Arial" w:hAnsi="Arial" w:cs="Arial"/>
+            <w:color w:val="4F81BD" w:themeColor="accent1"/>
+            <w:spacing w:val="-6"/>
+            <w:sz w:val="22"/>
+            <w:szCs w:val="22"/>
+            <w:u w:val="none"/>
+          </w:rPr>
+          <w:t xml:space="preserve"> 2025</w:t>
+        </w:r>
+        <w:r>
+          <w:rPr>
+            <w:rStyle w:val="Hyperlink"/>
+            <w:rFonts w:ascii="Arial" w:hAnsi="Arial" w:cs="Arial"/>
+            <w:color w:val="4F81BD" w:themeColor="accent1"/>
+            <w:spacing w:val="-6"/>
+            <w:sz w:val="22"/>
+            <w:szCs w:val="22"/>
+            <w:u w:val="none"/>
+          </w:rPr>
+          <w:t xml:space="preserve">  </w:t>
+        </w:r>
+        <w:r>
+          <w:rPr>
+            <w:rStyle w:val="Hyperlink"/>
+            <w:rFonts w:ascii="Arial" w:hAnsi="Arial" w:cs="Arial"/>
+            <w:b/>
+            <w:bCs/>
+            <w:color w:val="4F81BD" w:themeColor="accent1"/>
+            <w:spacing w:val="-6"/>
+            <w:sz w:val="22"/>
+            <w:szCs w:val="22"/>
+            <w:u w:val="none"/>
+          </w:rPr>
+          <w:t xml:space="preserve">                                                                                              </w:t>
+        </w:r>
+        <w:r>
+          <w:rPr>
+            <w:rStyle w:val="Hyperlink"/>
+            <w:rFonts w:ascii="Arial" w:hAnsi="Arial" w:cs="Arial"/>
+            <w:b/>
+            <w:bCs/>
+            <w:color w:val="4F81BD" w:themeColor="accent1"/>
+            <w:spacing w:val="-6"/>
+            <w:sz w:val="22"/>
+            <w:szCs w:val="22"/>
+            <w:u w:val="none"/>
+          </w:rPr>
+          <w:t xml:space="preserve"> </w:t>
+        </w:r>
+        <w:r>
+          <w:rPr>
+            <w:rStyle w:val="Hyperlink"/>
+            <w:rFonts w:ascii="Arial" w:hAnsi="Arial" w:cs="Arial"/>
+            <w:b/>
+            <w:bCs/>
+            <w:color w:val="4F81BD" w:themeColor="accent1"/>
+            <w:spacing w:val="-6"/>
+            <w:sz w:val="22"/>
+            <w:szCs w:val="22"/>
+            <w:u w:val="none"/>
+          </w:rPr>
+          <w:t xml:space="preserve">  </w:t>
+        </w:r>
+        <w:r>
+          <w:rPr>
+            <w:rStyle w:val="Hyperlink"/>
+            <w:rFonts w:ascii="Arial" w:hAnsi="Arial" w:cs="Arial"/>
+            <w:b/>
+            <w:bCs/>
+            <w:color w:val="4F81BD" w:themeColor="accent1"/>
+            <w:spacing w:val="-6"/>
+            <w:sz w:val="22"/>
+            <w:szCs w:val="22"/>
+            <w:u w:val="none"/>
+          </w:rPr>
           <w:t xml:space="preserve"> </w:t>
         </w:r>
       </w:hyperlink>
       <w:r>
         <w:rPr>
           <w:rFonts w:ascii="Arial" w:hAnsi="Arial" w:cs="Arial"/>
+          <w:b/>
+          <w:bCs/>
           <w:color w:val="002060"/>
           <w:spacing w:val="-6"/>
           <w:sz w:val="22"/>
@@ -1816,7 +1939,7 @@
         </w:rPr>
         <w:t xml:space="preserve"> | </w:t>
       </w:r>
-      <w:hyperlink r:id="rId14" w:history="1">
+      <w:hyperlink r:id="rId15" w:history="1">
         <w:r>
           <w:rPr>
             <w:rStyle w:val="Heading4Char"/>
@@ -1849,7 +1972,7 @@
           <w:sz w:val="20"/>
           <w:szCs w:val="20"/>
         </w:rPr>
-        <w:t xml:space="preserve">                             </w:t>
+        <w:t xml:space="preserve">                            </w:t>
       </w:r>
       <w:r>
         <w:rPr>
@@ -1857,8 +1980,59 @@
           <w:rFonts w:ascii="Arial" w:hAnsi="Arial" w:cs="Arial"/>
           <w:i w:val="0"/>
           <w:iCs w:val="0"/>
-        </w:rPr>
-        <w:t>Apr 2025</w:t>
+          <w:sz w:val="20"/>
+          <w:szCs w:val="20"/>
+        </w:rPr>
+        <w:t xml:space="preserve">     </w:t>
+      </w:r>
+      <w:r>
+        <w:rPr>
+          <w:rStyle w:val="Heading4Char"/>
+          <w:rFonts w:ascii="Arial" w:hAnsi="Arial" w:cs="Arial"/>
+          <w:i w:val="0"/>
+          <w:iCs w:val="0"/>
+          <w:sz w:val="20"/>
+          <w:szCs w:val="20"/>
+        </w:rPr>
+        <w:t xml:space="preserve"> </w:t>
+      </w:r>
+      <w:r>
+        <w:rPr>
+          <w:rStyle w:val="Heading4Char"/>
+          <w:rFonts w:ascii="Arial" w:hAnsi="Arial" w:cs="Arial"/>
+          <w:i w:val="0"/>
+          <w:iCs w:val="0"/>
+          <w:sz w:val="20"/>
+          <w:szCs w:val="20"/>
+        </w:rPr>
+        <w:t xml:space="preserve">  </w:t>
+      </w:r>
+      <w:r>
+        <w:rPr>
+          <w:rStyle w:val="Heading4Char"/>
+          <w:rFonts w:ascii="Arial" w:hAnsi="Arial" w:cs="Arial"/>
+          <w:i w:val="0"/>
+          <w:iCs w:val="0"/>
+        </w:rPr>
+        <w:t>Apr</w:t>
+      </w:r>
+      <w:r>
+        <w:rPr>
+          <w:rStyle w:val="Heading4Char"/>
+          <w:rFonts w:ascii="Arial" w:hAnsi="Arial" w:cs="Arial"/>
+          <w:i w:val="0"/>
+          <w:iCs w:val="0"/>
+        </w:rPr>
+        <w:t>’</w:t>
+      </w:r>
+      <w:r>
+        <w:rPr>
+          <w:rStyle w:val="Heading4Char"/>
+          <w:rFonts w:ascii="Arial" w:hAnsi="Arial" w:cs="Arial"/>
+          <w:i w:val="0"/>
+          <w:iCs w:val="0"/>
+        </w:rPr>
+        <w:t xml:space="preserve"> 2025</w:t>
       </w:r>
       <w:r>
         <w:rPr>
@@ -1930,7 +2104,7 @@
         </w:rPr>
         <w:t xml:space="preserve"> </w:t>
       </w:r>
-      <w:hyperlink r:id="rId15" w:history="1">
+      <w:hyperlink r:id="rId16" w:history="1">
         <w:proofErr w:type="spellStart"/>
         <w:r>
           <w:rPr>
@@ -1960,9 +2134,20 @@
         <w:t xml:space="preserve">                                         </w:t>
       </w:r>
       <w:r>
-        <w:t xml:space="preserve">                                                             </w:t>
-      </w:r>
-      <w:proofErr w:type="gramStart"/>
+        <w:t xml:space="preserve">                                                            </w:t>
+      </w:r>
+      <w:r>
+        <w:t xml:space="preserve">   </w:t>
+      </w:r>
+      <w:r>
+        <w:t xml:space="preserve"> </w:t>
+      </w:r>
+      <w:r>
+        <w:t xml:space="preserve">   </w:t>
+      </w:r>
+      <w:r>
+        <w:t xml:space="preserve"> </w:t>
+      </w:r>
       <w:r>
         <w:rPr>
           <w:rStyle w:val="Heading4Char"/>
@@ -1970,9 +2155,26 @@
           <w:i w:val="0"/>
           <w:iCs w:val="0"/>
         </w:rPr>
-        <w:t>Nov  2025</w:t>
-      </w:r>
-      <w:proofErr w:type="gramEnd"/>
+        <w:t>Nov</w:t>
+      </w:r>
+      <w:r>
+        <w:rPr>
+          <w:rStyle w:val="Heading4Char"/>
+          <w:rFonts w:ascii="Arial" w:hAnsi="Arial" w:cs="Arial"/>
+          <w:i w:val="0"/>
+          <w:iCs w:val="0"/>
+        </w:rPr>
+        <w:t>’</w:t>
+      </w:r>
+      <w:r>
+        <w:rPr>
+          <w:rStyle w:val="Heading4Char"/>
+          <w:rFonts w:ascii="Arial" w:hAnsi="Arial" w:cs="Arial"/>
+          <w:i w:val="0"/>
+          <w:iCs w:val="0"/>
+        </w:rPr>
+        <w:t xml:space="preserve"> 2025</w:t>
+      </w:r>
     </w:p>
     <w:p>
       <w:pPr>
@@ -2025,7 +2227,7 @@
         </w:rPr>
         <w:t xml:space="preserve"> </w:t>
       </w:r>
-      <w:hyperlink r:id="rId16" w:history="1">
+      <w:hyperlink r:id="rId17" w:history="1">
         <w:r>
           <w:rPr>
             <w:rStyle w:val="Heading4Char"/>
@@ -2072,6 +2274,34 @@
       </w:r>
       <w:r>
         <w:rPr>
+          <w:rFonts w:ascii="Arial" w:hAnsi="Arial" w:cs="Arial"/>
+          <w:sz w:val="20"/>
+        </w:rPr>
+        <w:t xml:space="preserve">  </w:t>
+      </w:r>
+      <w:r>
+        <w:rPr>
+          <w:rFonts w:ascii="Arial" w:hAnsi="Arial" w:cs="Arial"/>
+          <w:sz w:val="20"/>
+        </w:rPr>
+        <w:t xml:space="preserve">   </w:t>
+      </w:r>
+      <w:r>
+        <w:rPr>
+          <w:rFonts w:ascii="Arial" w:hAnsi="Arial" w:cs="Arial"/>
+          <w:sz w:val="20"/>
+        </w:rPr>
+        <w:t xml:space="preserve"> </w:t>
+      </w:r>
+      <w:r>
+        <w:rPr>
+          <w:rFonts w:ascii="Arial" w:hAnsi="Arial" w:cs="Arial"/>
+          <w:sz w:val="20"/>
+        </w:rPr>
+        <w:t xml:space="preserve"> </w:t>
+      </w:r>
+      <w:r>
+        <w:rPr>
           <w:rStyle w:val="Heading4Char"/>
           <w:rFonts w:ascii="Arial" w:hAnsi="Arial" w:cs="Arial"/>
           <w:i w:val="0"/>
@@ -2086,7 +2316,16 @@
           <w:i w:val="0"/>
           <w:iCs w:val="0"/>
         </w:rPr>
-        <w:t xml:space="preserve">   </w:t>
+        <w:t>’</w:t>
+      </w:r>
+      <w:r>
+        <w:rPr>
+          <w:rStyle w:val="Heading4Char"/>
+          <w:rFonts w:ascii="Arial" w:hAnsi="Arial" w:cs="Arial"/>
+          <w:i w:val="0"/>
+          <w:iCs w:val="0"/>
+        </w:rPr>
+        <w:t xml:space="preserve"> </w:t>
       </w:r>
       <w:r>
         <w:rPr>
@@ -2146,7 +2385,7 @@
         </w:rPr>
         <w:t xml:space="preserve"> </w:t>
       </w:r>
-      <w:hyperlink r:id="rId17" w:history="1">
+      <w:hyperlink r:id="rId18" w:history="1">
         <w:r>
           <w:rPr>
             <w:rStyle w:val="Heading4Char"/>
@@ -2210,12 +2449,54 @@
       </w:r>
       <w:r>
         <w:rPr>
+          <w:rFonts w:ascii="Arial" w:hAnsi="Arial" w:cs="Arial"/>
+          <w:spacing w:val="-4"/>
+          <w:sz w:val="20"/>
+        </w:rPr>
+        <w:t xml:space="preserve">    </w:t>
+      </w:r>
+      <w:r>
+        <w:rPr>
+          <w:rFonts w:ascii="Arial" w:hAnsi="Arial" w:cs="Arial"/>
+          <w:spacing w:val="-4"/>
+          <w:sz w:val="20"/>
+        </w:rPr>
+        <w:t xml:space="preserve">  </w:t>
+      </w:r>
+      <w:r>
+        <w:rPr>
+          <w:rFonts w:ascii="Arial" w:hAnsi="Arial" w:cs="Arial"/>
+          <w:spacing w:val="-4"/>
+          <w:sz w:val="20"/>
+        </w:rPr>
+        <w:t xml:space="preserve">  </w:t>
+      </w:r>
+      <w:r>
+        <w:rPr>
           <w:rStyle w:val="Heading4Char"/>
           <w:rFonts w:ascii="Arial" w:hAnsi="Arial" w:cs="Arial"/>
           <w:i w:val="0"/>
           <w:iCs w:val="0"/>
         </w:rPr>
-        <w:t>Sep   2024</w:t>
+        <w:t>Sep</w:t>
+      </w:r>
+      <w:r>
+        <w:rPr>
+          <w:rStyle w:val="Heading4Char"/>
+          <w:rFonts w:ascii="Arial" w:hAnsi="Arial" w:cs="Arial"/>
+          <w:i w:val="0"/>
+          <w:iCs w:val="0"/>
+        </w:rPr>
+        <w:t>’</w:t>
+      </w:r>
+      <w:r>
+        <w:rPr>
+          <w:rStyle w:val="Heading4Char"/>
+          <w:rFonts w:ascii="Arial" w:hAnsi="Arial" w:cs="Arial"/>
+          <w:i w:val="0"/>
+          <w:iCs w:val="0"/>
+        </w:rPr>
+        <w:t xml:space="preserve"> 2024</w:t>
       </w:r>
       <w:r>
         <w:rPr>
@@ -2575,7 +2856,7 @@
           <w:iCs w:val="0"/>
           <w:spacing w:val="-4"/>
         </w:rPr>
-        <w:t>7</w:t>
+        <w:t>6</w:t>
       </w:r>
       <w:r>
         <w:rPr>
@@ -3201,7 +3482,7 @@
         <v:path o:extrusionok="f" gradientshapeok="t" o:connecttype="rect"/>
         <o:lock v:ext="edit" aspectratio="t"/>
       </v:shapetype>
-      <v:shape id="_x0000_i1025" type="#_x0000_t75" style="width:7.8pt;height:7.8pt;visibility:visible" o:bullet="t">
+      <v:shape id="_x0000_i1025" type="#_x0000_t75" style="width:7.85pt;height:7.85pt;visibility:visible" o:bullet="t">
         <v:imagedata r:id="rId1" o:title=""/>
         <o:lock v:ext="edit" aspectratio="f"/>
       </v:shape>
@@ -7653,6 +7934,18 @@
       <w:rFonts w:ascii="Georgia" w:eastAsia="Georgia" w:hAnsi="Georgia" w:cs="Georgia"/>
     </w:rPr>
   </w:style>
+  <w:style w:type="character" w:styleId="IntenseEmphasis">
+    <w:name w:val="Intense Emphasis"/>
+    <w:basedOn w:val="DefaultParagraphFont"/>
+    <w:uiPriority w:val="21"/>
+    <w:qFormat/>
+    <w:rsid w:val="00270284"/>
+    <w:rPr>
+      <w:i/>
+      <w:iCs/>
+      <w:color w:val="4F81BD" w:themeColor="accent1"/>
+    </w:rPr>
+  </w:style>
 </w:styles>
 </file>
 

</xml_diff>